<commit_message>
Dev handover 27 Oct: afternoon update (desktop order, no 'How it helps'); template rebuilt on current live
Co-Authored-By: Claude Opus 5.5 <noreply@anthropic.com>
Claude-Session: https://claude.ai/code/session_01VYMABmaACTWphCvcsycDvZ
</commit_message>
<xml_diff>
--- a/handoff/MUTO_Dev_Handoff_PDP_v2_Cart_27Oct2026.docx
+++ b/handoff/MUTO_Dev_Handoff_PDP_v2_Cart_27Oct2026.docx
@@ -174,13 +174,82 @@
         <w:t xml:space="preserve">No section, asset, app or Skio changes.</w:t>
       </w:r>
     </w:p>
-    <w:bookmarkStart w:id="24" w:name="before-you-start"/>
+    <w:bookmarkStart w:id="22" w:name="Xcf592b0c80f566a68901cedf6360b879a3fe3d2"/>
     <w:p>
       <w:pPr>
         <w:pStyle w:val="Heading1"/>
       </w:pPr>
       <w:r>
-        <w:t xml:space="preserve">Before you start</w:t>
+        <w:t xml:space="preserve">Update, 27 October afternoon: replace the template once more</w:t>
+      </w:r>
+    </w:p>
+    <w:p>
+      <w:pPr>
+        <w:pStyle w:val="FirstParagraph"/>
+      </w:pPr>
+      <w:r>
+        <w:t xml:space="preserve">Live already has this morning’s two files.</w:t>
+      </w:r>
+      <w:r>
+        <w:t xml:space="preserve"> </w:t>
+      </w:r>
+      <w:r>
+        <w:rPr>
+          <w:bCs/>
+          <w:b/>
+        </w:rPr>
+        <w:t xml:space="preserve">Copy</w:t>
+      </w:r>
+      <w:r>
+        <w:rPr>
+          <w:bCs/>
+          <w:b/>
+        </w:rPr>
+        <w:t xml:space="preserve"> </w:t>
+      </w:r>
+      <w:r>
+        <w:rPr>
+          <w:rStyle w:val="VerbatimChar"/>
+          <w:bCs/>
+          <w:b/>
+        </w:rPr>
+        <w:t xml:space="preserve">templates/product.muto-nad-v2.json</w:t>
+      </w:r>
+      <w:r>
+        <w:rPr>
+          <w:bCs/>
+          <w:b/>
+        </w:rPr>
+        <w:t xml:space="preserve"> </w:t>
+      </w:r>
+      <w:r>
+        <w:rPr>
+          <w:bCs/>
+          <w:b/>
+        </w:rPr>
+        <w:t xml:space="preserve">once more</w:t>
+      </w:r>
+      <w:r>
+        <w:t xml:space="preserve"> </w:t>
+      </w:r>
+      <w:r>
+        <w:t xml:space="preserve">(the cart drawer hasn’t changed). The new file is built from live as it stands now, so nothing on live is lost. It changes</w:t>
+      </w:r>
+      <w:r>
+        <w:t xml:space="preserve"> </w:t>
+      </w:r>
+      <w:r>
+        <w:rPr>
+          <w:bCs/>
+          <w:b/>
+        </w:rPr>
+        <w:t xml:space="preserve">desktop</w:t>
+      </w:r>
+      <w:r>
+        <w:t xml:space="preserve"> </w:t>
+      </w:r>
+      <w:r>
+        <w:t xml:space="preserve">to match phones:</w:t>
       </w:r>
     </w:p>
     <w:p>
@@ -188,6 +257,82 @@
         <w:numPr>
           <w:ilvl w:val="0"/>
           <w:numId w:val="1002"/>
+        </w:numPr>
+        <w:pStyle w:val="Compact"/>
+      </w:pPr>
+      <w:r>
+        <w:t xml:space="preserve">The offer (</w:t>
+      </w:r>
+      <w:r>
+        <w:t xml:space="preserve">“</w:t>
+      </w:r>
+      <w:r>
+        <w:t xml:space="preserve">Choose your plan</w:t>
+      </w:r>
+      <w:r>
+        <w:t xml:space="preserve">”</w:t>
+      </w:r>
+      <w:r>
+        <w:t xml:space="preserve">, plans, one-time, button) comes straight after the stars, title and descriptor.</w:t>
+      </w:r>
+    </w:p>
+    <w:p>
+      <w:pPr>
+        <w:numPr>
+          <w:ilvl w:val="0"/>
+          <w:numId w:val="1002"/>
+        </w:numPr>
+        <w:pStyle w:val="Compact"/>
+      </w:pPr>
+      <w:r>
+        <w:t xml:space="preserve">The serving line and description move below the button.</w:t>
+      </w:r>
+    </w:p>
+    <w:p>
+      <w:pPr>
+        <w:numPr>
+          <w:ilvl w:val="0"/>
+          <w:numId w:val="1002"/>
+        </w:numPr>
+        <w:pStyle w:val="Compact"/>
+      </w:pPr>
+      <w:r>
+        <w:t xml:space="preserve">The</w:t>
+      </w:r>
+      <w:r>
+        <w:t xml:space="preserve"> </w:t>
+      </w:r>
+      <w:r>
+        <w:t xml:space="preserve">“</w:t>
+      </w:r>
+      <w:r>
+        <w:t xml:space="preserve">How it helps</w:t>
+      </w:r>
+      <w:r>
+        <w:t xml:space="preserve">”</w:t>
+      </w:r>
+      <w:r>
+        <w:t xml:space="preserve"> </w:t>
+      </w:r>
+      <w:r>
+        <w:t xml:space="preserve">list is hidden on desktop.</w:t>
+      </w:r>
+    </w:p>
+    <w:bookmarkEnd w:id="22"/>
+    <w:bookmarkStart w:id="25" w:name="before-you-start"/>
+    <w:p>
+      <w:pPr>
+        <w:pStyle w:val="Heading1"/>
+      </w:pPr>
+      <w:r>
+        <w:t xml:space="preserve">Before you start</w:t>
+      </w:r>
+    </w:p>
+    <w:p>
+      <w:pPr>
+        <w:numPr>
+          <w:ilvl w:val="0"/>
+          <w:numId w:val="1003"/>
         </w:numPr>
         <w:pStyle w:val="Compact"/>
       </w:pPr>
@@ -341,7 +486,7 @@
       <w:pPr>
         <w:numPr>
           <w:ilvl w:val="0"/>
-          <w:numId w:val="1003"/>
+          <w:numId w:val="1004"/>
         </w:numPr>
         <w:pStyle w:val="Compact"/>
       </w:pPr>
@@ -393,11 +538,11 @@
       <w:pPr>
         <w:numPr>
           <w:ilvl w:val="1"/>
-          <w:numId w:val="1004"/>
-        </w:numPr>
-        <w:pStyle w:val="Compact"/>
-      </w:pPr>
-      <w:hyperlink r:id="rId22">
+          <w:numId w:val="1005"/>
+        </w:numPr>
+        <w:pStyle w:val="Compact"/>
+      </w:pPr>
+      <w:hyperlink r:id="rId23">
         <w:r>
           <w:rPr>
             <w:rStyle w:val="Hyperlink"/>
@@ -410,11 +555,11 @@
       <w:pPr>
         <w:numPr>
           <w:ilvl w:val="1"/>
-          <w:numId w:val="1004"/>
-        </w:numPr>
-        <w:pStyle w:val="Compact"/>
-      </w:pPr>
-      <w:hyperlink r:id="rId23">
+          <w:numId w:val="1005"/>
+        </w:numPr>
+        <w:pStyle w:val="Compact"/>
+      </w:pPr>
+      <w:hyperlink r:id="rId24">
         <w:r>
           <w:rPr>
             <w:rStyle w:val="Hyperlink"/>
@@ -427,7 +572,7 @@
       <w:pPr>
         <w:numPr>
           <w:ilvl w:val="0"/>
-          <w:numId w:val="1003"/>
+          <w:numId w:val="1004"/>
         </w:numPr>
         <w:pStyle w:val="Compact"/>
       </w:pPr>
@@ -445,8 +590,8 @@
         <w:t xml:space="preserve">On 27 Oct, live still matched them. If either file has been edited on live since, tell me before copying, so those edits aren’t lost.</w:t>
       </w:r>
     </w:p>
-    <w:bookmarkEnd w:id="24"/>
-    <w:bookmarkStart w:id="25" w:name="step-1-copy-the-2-files"/>
+    <w:bookmarkEnd w:id="25"/>
+    <w:bookmarkStart w:id="26" w:name="step-1-copy-the-2-files"/>
     <w:p>
       <w:pPr>
         <w:pStyle w:val="Heading1"/>
@@ -484,91 +629,6 @@
       </w:r>
       <w:r>
         <w:t xml:space="preserve">:</w:t>
-      </w:r>
-    </w:p>
-    <w:p>
-      <w:pPr>
-        <w:numPr>
-          <w:ilvl w:val="0"/>
-          <w:numId w:val="1005"/>
-        </w:numPr>
-        <w:pStyle w:val="Compact"/>
-      </w:pPr>
-      <w:r>
-        <w:t xml:space="preserve">Open</w:t>
-      </w:r>
-      <w:r>
-        <w:t xml:space="preserve"> </w:t>
-      </w:r>
-      <w:r>
-        <w:rPr>
-          <w:rStyle w:val="VerbatimChar"/>
-        </w:rPr>
-        <w:t xml:space="preserve">templates/product.muto-nad-v2.json</w:t>
-      </w:r>
-      <w:r>
-        <w:t xml:space="preserve">, replace everything with the file from the zip, and save.</w:t>
-      </w:r>
-    </w:p>
-    <w:p>
-      <w:pPr>
-        <w:numPr>
-          <w:ilvl w:val="0"/>
-          <w:numId w:val="1005"/>
-        </w:numPr>
-        <w:pStyle w:val="Compact"/>
-      </w:pPr>
-      <w:r>
-        <w:t xml:space="preserve">Open</w:t>
-      </w:r>
-      <w:r>
-        <w:t xml:space="preserve"> </w:t>
-      </w:r>
-      <w:r>
-        <w:rPr>
-          <w:rStyle w:val="VerbatimChar"/>
-        </w:rPr>
-        <w:t xml:space="preserve">snippets/cart-drawer.liquid</w:t>
-      </w:r>
-      <w:r>
-        <w:t xml:space="preserve">, replace everything with the file from the zip, and save.</w:t>
-      </w:r>
-    </w:p>
-    <w:p>
-      <w:pPr>
-        <w:pStyle w:val="FirstParagraph"/>
-      </w:pPr>
-      <w:r>
-        <w:rPr>
-          <w:bCs/>
-          <w:b/>
-        </w:rPr>
-        <w:t xml:space="preserve">The other way to do it:</w:t>
-      </w:r>
-      <w:r>
-        <w:t xml:space="preserve"> </w:t>
-      </w:r>
-      <w:r>
-        <w:t xml:space="preserve">publish the preview theme instead. It’s a full copy of live from this morning with only these 2 files changed.</w:t>
-      </w:r>
-    </w:p>
-    <w:bookmarkEnd w:id="25"/>
-    <w:bookmarkStart w:id="29" w:name="what-changes"/>
-    <w:p>
-      <w:pPr>
-        <w:pStyle w:val="Heading1"/>
-      </w:pPr>
-      <w:r>
-        <w:t xml:space="preserve">What changes</w:t>
-      </w:r>
-    </w:p>
-    <w:bookmarkStart w:id="26" w:name="product-page-plans"/>
-    <w:p>
-      <w:pPr>
-        <w:pStyle w:val="Heading2"/>
-      </w:pPr>
-      <w:r>
-        <w:t xml:space="preserve">Product page: plans</w:t>
       </w:r>
     </w:p>
     <w:p>
@@ -580,55 +640,19 @@
         <w:pStyle w:val="Compact"/>
       </w:pPr>
       <w:r>
-        <w:rPr>
-          <w:bCs/>
-          <w:b/>
-        </w:rPr>
-        <w:t xml:space="preserve">Quarterly:</w:t>
-      </w:r>
-      <w:r>
-        <w:t xml:space="preserve"> </w:t>
-      </w:r>
-      <w:r>
-        <w:rPr>
-          <w:bCs/>
-          <w:b/>
-        </w:rPr>
-        <w:t xml:space="preserve">£50/mo</w:t>
-      </w:r>
-      <w:r>
-        <w:t xml:space="preserve">, with</w:t>
-      </w:r>
-      <w:r>
-        <w:t xml:space="preserve"> </w:t>
-      </w:r>
-      <w:r>
-        <w:rPr>
-          <w:strike/>
-        </w:rPr>
-        <w:t xml:space="preserve">£70</w:t>
-      </w:r>
-      <w:r>
-        <w:t xml:space="preserve"> </w:t>
-      </w:r>
-      <w:r>
-        <w:t xml:space="preserve">underneath. A cyan</w:t>
-      </w:r>
-      <w:r>
-        <w:t xml:space="preserve"> </w:t>
-      </w:r>
-      <w:r>
-        <w:rPr>
-          <w:bCs/>
-          <w:b/>
-        </w:rPr>
-        <w:t xml:space="preserve">SAVE 28%</w:t>
-      </w:r>
-      <w:r>
-        <w:t xml:space="preserve"> </w:t>
-      </w:r>
-      <w:r>
-        <w:t xml:space="preserve">tag sits in the box’s top-left corner.</w:t>
+        <w:t xml:space="preserve">Open</w:t>
+      </w:r>
+      <w:r>
+        <w:t xml:space="preserve"> </w:t>
+      </w:r>
+      <w:r>
+        <w:rPr>
+          <w:rStyle w:val="VerbatimChar"/>
+        </w:rPr>
+        <w:t xml:space="preserve">templates/product.muto-nad-v2.json</w:t>
+      </w:r>
+      <w:r>
+        <w:t xml:space="preserve">, replace everything with the file from the zip, and save.</w:t>
       </w:r>
     </w:p>
     <w:p>
@@ -640,309 +664,56 @@
         <w:pStyle w:val="Compact"/>
       </w:pPr>
       <w:r>
-        <w:rPr>
-          <w:bCs/>
-          <w:b/>
-        </w:rPr>
-        <w:t xml:space="preserve">Monthly:</w:t>
-      </w:r>
-      <w:r>
-        <w:t xml:space="preserve"> </w:t>
-      </w:r>
-      <w:r>
-        <w:rPr>
-          <w:bCs/>
-          <w:b/>
-        </w:rPr>
-        <w:t xml:space="preserve">£60/mo</w:t>
-      </w:r>
-      <w:r>
-        <w:t xml:space="preserve">, with</w:t>
-      </w:r>
-      <w:r>
-        <w:t xml:space="preserve"> </w:t>
-      </w:r>
-      <w:r>
-        <w:rPr>
-          <w:strike/>
-        </w:rPr>
-        <w:t xml:space="preserve">£70</w:t>
-      </w:r>
-      <w:r>
-        <w:t xml:space="preserve"> </w:t>
-      </w:r>
-      <w:r>
-        <w:t xml:space="preserve">underneath, and a</w:t>
-      </w:r>
-      <w:r>
-        <w:t xml:space="preserve"> </w:t>
-      </w:r>
-      <w:r>
-        <w:rPr>
-          <w:bCs/>
-          <w:b/>
-        </w:rPr>
-        <w:t xml:space="preserve">SAVE 14%</w:t>
-      </w:r>
-      <w:r>
-        <w:t xml:space="preserve"> </w:t>
-      </w:r>
-      <w:r>
-        <w:t xml:space="preserve">tag.</w:t>
-      </w:r>
-    </w:p>
-    <w:p>
-      <w:pPr>
-        <w:numPr>
-          <w:ilvl w:val="0"/>
-          <w:numId w:val="1006"/>
-        </w:numPr>
-        <w:pStyle w:val="Compact"/>
-      </w:pPr>
-      <w:r>
-        <w:rPr>
-          <w:bCs/>
-          <w:b/>
-        </w:rPr>
-        <w:t xml:space="preserve">“</w:t>
-      </w:r>
-      <w:r>
-        <w:rPr>
-          <w:bCs/>
-          <w:b/>
-        </w:rPr>
-        <w:t xml:space="preserve">Best value</w:t>
-      </w:r>
-      <w:r>
-        <w:rPr>
-          <w:bCs/>
-          <w:b/>
-        </w:rPr>
-        <w:t xml:space="preserve">”</w:t>
-      </w:r>
-      <w:r>
-        <w:rPr>
-          <w:bCs/>
-          <w:b/>
-        </w:rPr>
-        <w:t xml:space="preserve"> </w:t>
-      </w:r>
-      <w:r>
-        <w:rPr>
-          <w:bCs/>
-          <w:b/>
-        </w:rPr>
-        <w:t xml:space="preserve">bar:</w:t>
-      </w:r>
-      <w:r>
-        <w:t xml:space="preserve"> </w:t>
-      </w:r>
-      <w:r>
-        <w:t xml:space="preserve">the dark bar over Quarterly reads</w:t>
-      </w:r>
-      <w:r>
-        <w:t xml:space="preserve"> </w:t>
-      </w:r>
-      <w:r>
-        <w:t xml:space="preserve">“</w:t>
-      </w:r>
-      <w:r>
-        <w:t xml:space="preserve">✦ BEST VALUE · New customers: free welcome kit worth £77</w:t>
-      </w:r>
-      <w:r>
-        <w:t xml:space="preserve">”</w:t>
-      </w:r>
-      <w:r>
-        <w:t xml:space="preserve">.</w:t>
-      </w:r>
-    </w:p>
-    <w:p>
-      <w:pPr>
-        <w:numPr>
-          <w:ilvl w:val="0"/>
-          <w:numId w:val="1006"/>
-        </w:numPr>
-        <w:pStyle w:val="Compact"/>
-      </w:pPr>
-      <w:r>
-        <w:rPr>
-          <w:bCs/>
-          <w:b/>
-        </w:rPr>
-        <w:t xml:space="preserve">Billing lines:</w:t>
-      </w:r>
-      <w:r>
-        <w:t xml:space="preserve"> </w:t>
-      </w:r>
-      <w:r>
-        <w:t xml:space="preserve">unchanged (</w:t>
-      </w:r>
-      <w:r>
-        <w:t xml:space="preserve">“</w:t>
-      </w:r>
-      <w:r>
-        <w:t xml:space="preserve">billed £150 every 3 months</w:t>
-      </w:r>
-      <w:r>
-        <w:t xml:space="preserve">”</w:t>
-      </w:r>
-      <w:r>
-        <w:t xml:space="preserve">,</w:t>
-      </w:r>
-      <w:r>
-        <w:t xml:space="preserve"> </w:t>
-      </w:r>
-      <w:r>
-        <w:t xml:space="preserve">“</w:t>
-      </w:r>
-      <w:r>
-        <w:t xml:space="preserve">billed £60 every 4 weeks</w:t>
-      </w:r>
-      <w:r>
-        <w:t xml:space="preserve">”</w:t>
-      </w:r>
-      <w:r>
-        <w:t xml:space="preserve">).</w:t>
-      </w:r>
-      <w:r>
-        <w:t xml:space="preserve"> </w:t>
-      </w:r>
-      <w:r>
-        <w:rPr>
-          <w:bCs/>
-          <w:b/>
-        </w:rPr>
-        <w:t xml:space="preserve">Skio isn’t changed.</w:t>
-      </w:r>
-      <w:r>
-        <w:t xml:space="preserve"> </w:t>
-      </w:r>
-      <w:r>
-        <w:t xml:space="preserve">It still bills £150 every 3 months and £60 every 4 weeks.</w:t>
-      </w:r>
-    </w:p>
-    <w:p>
-      <w:pPr>
-        <w:numPr>
-          <w:ilvl w:val="0"/>
-          <w:numId w:val="1006"/>
-        </w:numPr>
-        <w:pStyle w:val="Compact"/>
-      </w:pPr>
-      <w:r>
-        <w:rPr>
-          <w:bCs/>
-          <w:b/>
-        </w:rPr>
-        <w:t xml:space="preserve">The button:</w:t>
-      </w:r>
-      <w:r>
-        <w:t xml:space="preserve"> </w:t>
-      </w:r>
-      <w:r>
-        <w:t xml:space="preserve">reads</w:t>
-      </w:r>
-      <w:r>
-        <w:t xml:space="preserve"> </w:t>
-      </w:r>
-      <w:r>
-        <w:rPr>
-          <w:bCs/>
-          <w:b/>
-        </w:rPr>
-        <w:t xml:space="preserve">Add to cart</w:t>
-      </w:r>
-      <w:r>
-        <w:t xml:space="preserve">, with no price on it.</w:t>
-      </w:r>
-    </w:p>
-    <w:p>
-      <w:pPr>
-        <w:numPr>
-          <w:ilvl w:val="0"/>
-          <w:numId w:val="1006"/>
-        </w:numPr>
-        <w:pStyle w:val="Compact"/>
-      </w:pPr>
-      <w:r>
-        <w:rPr>
-          <w:bCs/>
-          <w:b/>
-        </w:rPr>
-        <w:t xml:space="preserve">Sticky bar at the bottom:</w:t>
-      </w:r>
-      <w:r>
-        <w:t xml:space="preserve"> </w:t>
-      </w:r>
-      <w:r>
-        <w:t xml:space="preserve">shows the per-month price for the selected plan,</w:t>
-      </w:r>
-      <w:r>
-        <w:t xml:space="preserve"> </w:t>
-      </w:r>
-      <w:r>
-        <w:t xml:space="preserve">“</w:t>
-      </w:r>
-      <w:r>
-        <w:t xml:space="preserve">Add to cart</w:t>
-      </w:r>
-      <w:r>
-        <w:t xml:space="preserve"> </w:t>
-      </w:r>
-      <w:r>
-        <w:rPr>
-          <w:strike/>
-        </w:rPr>
-        <w:t xml:space="preserve">£70</w:t>
-      </w:r>
-      <w:r>
-        <w:t xml:space="preserve"> </w:t>
-      </w:r>
-      <w:r>
-        <w:t xml:space="preserve">£50/mo</w:t>
-      </w:r>
-      <w:r>
-        <w:t xml:space="preserve">”</w:t>
-      </w:r>
-      <w:r>
-        <w:t xml:space="preserve"> </w:t>
-      </w:r>
-      <w:r>
-        <w:t xml:space="preserve">or</w:t>
-      </w:r>
-      <w:r>
-        <w:t xml:space="preserve"> </w:t>
-      </w:r>
-      <w:r>
-        <w:t xml:space="preserve">“</w:t>
-      </w:r>
-      <w:r>
-        <w:rPr>
-          <w:strike/>
-        </w:rPr>
-        <w:t xml:space="preserve">£70</w:t>
-      </w:r>
-      <w:r>
-        <w:t xml:space="preserve"> </w:t>
-      </w:r>
-      <w:r>
-        <w:t xml:space="preserve">£60/mo</w:t>
-      </w:r>
-      <w:r>
-        <w:t xml:space="preserve">”</w:t>
-      </w:r>
-      <w:r>
-        <w:t xml:space="preserve">.</w:t>
+        <w:t xml:space="preserve">Open</w:t>
+      </w:r>
+      <w:r>
+        <w:t xml:space="preserve"> </w:t>
+      </w:r>
+      <w:r>
+        <w:rPr>
+          <w:rStyle w:val="VerbatimChar"/>
+        </w:rPr>
+        <w:t xml:space="preserve">snippets/cart-drawer.liquid</w:t>
+      </w:r>
+      <w:r>
+        <w:t xml:space="preserve">, replace everything with the file from the zip, and save.</w:t>
+      </w:r>
+    </w:p>
+    <w:p>
+      <w:pPr>
+        <w:pStyle w:val="FirstParagraph"/>
+      </w:pPr>
+      <w:r>
+        <w:rPr>
+          <w:bCs/>
+          <w:b/>
+        </w:rPr>
+        <w:t xml:space="preserve">The other way to do it:</w:t>
+      </w:r>
+      <w:r>
+        <w:t xml:space="preserve"> </w:t>
+      </w:r>
+      <w:r>
+        <w:t xml:space="preserve">publish the preview theme instead. It’s a full copy of live from this morning with only these 2 files changed.</w:t>
       </w:r>
     </w:p>
     <w:bookmarkEnd w:id="26"/>
-    <w:bookmarkStart w:id="27" w:name="product-page-top-of-page"/>
+    <w:bookmarkStart w:id="30" w:name="what-changes"/>
+    <w:p>
+      <w:pPr>
+        <w:pStyle w:val="Heading1"/>
+      </w:pPr>
+      <w:r>
+        <w:t xml:space="preserve">What changes</w:t>
+      </w:r>
+    </w:p>
+    <w:bookmarkStart w:id="27" w:name="product-page-plans"/>
     <w:p>
       <w:pPr>
         <w:pStyle w:val="Heading2"/>
       </w:pPr>
       <w:r>
-        <w:t xml:space="preserve">Product page: top of page</w:t>
+        <w:t xml:space="preserve">Product page: plans</w:t>
       </w:r>
     </w:p>
     <w:p>
@@ -958,153 +729,51 @@
           <w:bCs/>
           <w:b/>
         </w:rPr>
-        <w:t xml:space="preserve">On phones, AgeMate-style, from the top:</w:t>
-      </w:r>
-    </w:p>
-    <w:p>
-      <w:pPr>
-        <w:numPr>
-          <w:ilvl w:val="1"/>
-          <w:numId w:val="1008"/>
-        </w:numPr>
-        <w:pStyle w:val="Compact"/>
-      </w:pPr>
-      <w:r>
-        <w:t xml:space="preserve">Stars and</w:t>
-      </w:r>
-      <w:r>
-        <w:t xml:space="preserve"> </w:t>
-      </w:r>
-      <w:r>
-        <w:t xml:space="preserve">“</w:t>
-      </w:r>
-      <w:r>
-        <w:t xml:space="preserve">4.83 out of 5</w:t>
-      </w:r>
-      <w:r>
-        <w:t xml:space="preserve">”</w:t>
-      </w:r>
-      <w:r>
-        <w:t xml:space="preserve"> </w:t>
-      </w:r>
-      <w:r>
-        <w:t xml:space="preserve">(bigger stars, Neue Haas, no underline).</w:t>
-      </w:r>
-    </w:p>
-    <w:p>
-      <w:pPr>
-        <w:numPr>
-          <w:ilvl w:val="1"/>
-          <w:numId w:val="1008"/>
-        </w:numPr>
-        <w:pStyle w:val="Compact"/>
-      </w:pPr>
-      <w:r>
-        <w:rPr>
-          <w:bCs/>
-          <w:b/>
-        </w:rPr>
-        <w:t xml:space="preserve">NAD+ Cellular Complex</w:t>
-      </w:r>
-      <w:r>
-        <w:t xml:space="preserve">.</w:t>
-      </w:r>
-    </w:p>
-    <w:p>
-      <w:pPr>
-        <w:numPr>
-          <w:ilvl w:val="1"/>
-          <w:numId w:val="1008"/>
-        </w:numPr>
-        <w:pStyle w:val="Compact"/>
-      </w:pPr>
-      <w:r>
-        <w:t xml:space="preserve">“</w:t>
-      </w:r>
-      <w:r>
-        <w:t xml:space="preserve">Everything your body needs after 35 for energy, recovery, stress, immunity and longevity.</w:t>
-      </w:r>
-      <w:r>
-        <w:t xml:space="preserve">”</w:t>
-      </w:r>
-    </w:p>
-    <w:p>
-      <w:pPr>
-        <w:numPr>
-          <w:ilvl w:val="1"/>
-          <w:numId w:val="1008"/>
-        </w:numPr>
-        <w:pStyle w:val="Compact"/>
-      </w:pPr>
-      <w:r>
-        <w:t xml:space="preserve">The images.</w:t>
-      </w:r>
-    </w:p>
-    <w:p>
-      <w:pPr>
-        <w:numPr>
-          <w:ilvl w:val="1"/>
-          <w:numId w:val="1008"/>
-        </w:numPr>
-        <w:pStyle w:val="Compact"/>
-      </w:pPr>
-      <w:r>
-        <w:t xml:space="preserve">A</w:t>
-      </w:r>
-      <w:r>
-        <w:t xml:space="preserve"> </w:t>
-      </w:r>
-      <w:r>
-        <w:rPr>
-          <w:bCs/>
-          <w:b/>
-        </w:rPr>
-        <w:t xml:space="preserve">View third-party testing results</w:t>
-      </w:r>
-      <w:r>
-        <w:t xml:space="preserve"> </w:t>
-      </w:r>
-      <w:r>
-        <w:t xml:space="preserve">button.</w:t>
-      </w:r>
-    </w:p>
-    <w:p>
-      <w:pPr>
-        <w:numPr>
-          <w:ilvl w:val="1"/>
-          <w:numId w:val="1008"/>
-        </w:numPr>
-        <w:pStyle w:val="Compact"/>
-      </w:pPr>
-      <w:r>
-        <w:t xml:space="preserve">The offer: Black Friday box,</w:t>
-      </w:r>
-      <w:r>
-        <w:t xml:space="preserve"> </w:t>
-      </w:r>
-      <w:r>
-        <w:t xml:space="preserve">“</w:t>
-      </w:r>
-      <w:r>
-        <w:t xml:space="preserve">Choose your plan</w:t>
-      </w:r>
-      <w:r>
-        <w:t xml:space="preserve">”</w:t>
-      </w:r>
-      <w:r>
-        <w:t xml:space="preserve">, plans, one-time and the button.</w:t>
-      </w:r>
-    </w:p>
-    <w:p>
-      <w:pPr>
-        <w:numPr>
-          <w:ilvl w:val="1"/>
-          <w:numId w:val="1008"/>
-        </w:numPr>
-        <w:pStyle w:val="Compact"/>
-      </w:pPr>
-      <w:r>
-        <w:t xml:space="preserve">The description, benefits, reviews and folds.</w:t>
+        <w:t xml:space="preserve">Quarterly:</w:t>
+      </w:r>
+      <w:r>
+        <w:t xml:space="preserve"> </w:t>
+      </w:r>
+      <w:r>
+        <w:rPr>
+          <w:bCs/>
+          <w:b/>
+        </w:rPr>
+        <w:t xml:space="preserve">£50/mo</w:t>
+      </w:r>
+      <w:r>
+        <w:t xml:space="preserve">, with</w:t>
+      </w:r>
+      <w:r>
+        <w:t xml:space="preserve"> </w:t>
+      </w:r>
+      <w:r>
+        <w:rPr>
+          <w:strike/>
+        </w:rPr>
+        <w:t xml:space="preserve">£70</w:t>
+      </w:r>
+      <w:r>
+        <w:t xml:space="preserve"> </w:t>
+      </w:r>
+      <w:r>
+        <w:t xml:space="preserve">underneath. A cyan</w:t>
+      </w:r>
+      <w:r>
+        <w:t xml:space="preserve"> </w:t>
+      </w:r>
+      <w:r>
+        <w:rPr>
+          <w:bCs/>
+          <w:b/>
+        </w:rPr>
+        <w:t xml:space="preserve">SAVE 28%</w:t>
+      </w:r>
+      <w:r>
+        <w:t xml:space="preserve"> </w:t>
+      </w:r>
+      <w:r>
+        <w:t xml:space="preserve">tag sits in the box’s top-left corner.</w:t>
       </w:r>
     </w:p>
     <w:p>
@@ -1120,13 +789,51 @@
           <w:bCs/>
           <w:b/>
         </w:rPr>
-        <w:t xml:space="preserve">On desktop:</w:t>
-      </w:r>
-      <w:r>
-        <w:t xml:space="preserve"> </w:t>
-      </w:r>
-      <w:r>
-        <w:t xml:space="preserve">the same parts in the existing two-column layout.</w:t>
+        <w:t xml:space="preserve">Monthly:</w:t>
+      </w:r>
+      <w:r>
+        <w:t xml:space="preserve"> </w:t>
+      </w:r>
+      <w:r>
+        <w:rPr>
+          <w:bCs/>
+          <w:b/>
+        </w:rPr>
+        <w:t xml:space="preserve">£60/mo</w:t>
+      </w:r>
+      <w:r>
+        <w:t xml:space="preserve">, with</w:t>
+      </w:r>
+      <w:r>
+        <w:t xml:space="preserve"> </w:t>
+      </w:r>
+      <w:r>
+        <w:rPr>
+          <w:strike/>
+        </w:rPr>
+        <w:t xml:space="preserve">£70</w:t>
+      </w:r>
+      <w:r>
+        <w:t xml:space="preserve"> </w:t>
+      </w:r>
+      <w:r>
+        <w:t xml:space="preserve">underneath, and a</w:t>
+      </w:r>
+      <w:r>
+        <w:t xml:space="preserve"> </w:t>
+      </w:r>
+      <w:r>
+        <w:rPr>
+          <w:bCs/>
+          <w:b/>
+        </w:rPr>
+        <w:t xml:space="preserve">SAVE 14%</w:t>
+      </w:r>
+      <w:r>
+        <w:t xml:space="preserve"> </w:t>
+      </w:r>
+      <w:r>
+        <w:t xml:space="preserve">tag.</w:t>
       </w:r>
     </w:p>
     <w:p>
@@ -1142,7 +849,261 @@
           <w:bCs/>
           <w:b/>
         </w:rPr>
-        <w:t xml:space="preserve">Removed:</w:t>
+        <w:t xml:space="preserve">“</w:t>
+      </w:r>
+      <w:r>
+        <w:rPr>
+          <w:bCs/>
+          <w:b/>
+        </w:rPr>
+        <w:t xml:space="preserve">Best value</w:t>
+      </w:r>
+      <w:r>
+        <w:rPr>
+          <w:bCs/>
+          <w:b/>
+        </w:rPr>
+        <w:t xml:space="preserve">”</w:t>
+      </w:r>
+      <w:r>
+        <w:rPr>
+          <w:bCs/>
+          <w:b/>
+        </w:rPr>
+        <w:t xml:space="preserve"> </w:t>
+      </w:r>
+      <w:r>
+        <w:rPr>
+          <w:bCs/>
+          <w:b/>
+        </w:rPr>
+        <w:t xml:space="preserve">bar:</w:t>
+      </w:r>
+      <w:r>
+        <w:t xml:space="preserve"> </w:t>
+      </w:r>
+      <w:r>
+        <w:t xml:space="preserve">the dark bar over Quarterly reads</w:t>
+      </w:r>
+      <w:r>
+        <w:t xml:space="preserve"> </w:t>
+      </w:r>
+      <w:r>
+        <w:t xml:space="preserve">“</w:t>
+      </w:r>
+      <w:r>
+        <w:t xml:space="preserve">✦ BEST VALUE · New customers: free welcome kit worth £77</w:t>
+      </w:r>
+      <w:r>
+        <w:t xml:space="preserve">”</w:t>
+      </w:r>
+      <w:r>
+        <w:t xml:space="preserve">.</w:t>
+      </w:r>
+    </w:p>
+    <w:p>
+      <w:pPr>
+        <w:numPr>
+          <w:ilvl w:val="0"/>
+          <w:numId w:val="1007"/>
+        </w:numPr>
+        <w:pStyle w:val="Compact"/>
+      </w:pPr>
+      <w:r>
+        <w:rPr>
+          <w:bCs/>
+          <w:b/>
+        </w:rPr>
+        <w:t xml:space="preserve">Billing lines:</w:t>
+      </w:r>
+      <w:r>
+        <w:t xml:space="preserve"> </w:t>
+      </w:r>
+      <w:r>
+        <w:t xml:space="preserve">unchanged (</w:t>
+      </w:r>
+      <w:r>
+        <w:t xml:space="preserve">“</w:t>
+      </w:r>
+      <w:r>
+        <w:t xml:space="preserve">billed £150 every 3 months</w:t>
+      </w:r>
+      <w:r>
+        <w:t xml:space="preserve">”</w:t>
+      </w:r>
+      <w:r>
+        <w:t xml:space="preserve">,</w:t>
+      </w:r>
+      <w:r>
+        <w:t xml:space="preserve"> </w:t>
+      </w:r>
+      <w:r>
+        <w:t xml:space="preserve">“</w:t>
+      </w:r>
+      <w:r>
+        <w:t xml:space="preserve">billed £60 every 4 weeks</w:t>
+      </w:r>
+      <w:r>
+        <w:t xml:space="preserve">”</w:t>
+      </w:r>
+      <w:r>
+        <w:t xml:space="preserve">).</w:t>
+      </w:r>
+      <w:r>
+        <w:t xml:space="preserve"> </w:t>
+      </w:r>
+      <w:r>
+        <w:rPr>
+          <w:bCs/>
+          <w:b/>
+        </w:rPr>
+        <w:t xml:space="preserve">Skio isn’t changed.</w:t>
+      </w:r>
+      <w:r>
+        <w:t xml:space="preserve"> </w:t>
+      </w:r>
+      <w:r>
+        <w:t xml:space="preserve">It still bills £150 every 3 months and £60 every 4 weeks.</w:t>
+      </w:r>
+    </w:p>
+    <w:p>
+      <w:pPr>
+        <w:numPr>
+          <w:ilvl w:val="0"/>
+          <w:numId w:val="1007"/>
+        </w:numPr>
+        <w:pStyle w:val="Compact"/>
+      </w:pPr>
+      <w:r>
+        <w:rPr>
+          <w:bCs/>
+          <w:b/>
+        </w:rPr>
+        <w:t xml:space="preserve">The button:</w:t>
+      </w:r>
+      <w:r>
+        <w:t xml:space="preserve"> </w:t>
+      </w:r>
+      <w:r>
+        <w:t xml:space="preserve">reads</w:t>
+      </w:r>
+      <w:r>
+        <w:t xml:space="preserve"> </w:t>
+      </w:r>
+      <w:r>
+        <w:rPr>
+          <w:bCs/>
+          <w:b/>
+        </w:rPr>
+        <w:t xml:space="preserve">Add to cart</w:t>
+      </w:r>
+      <w:r>
+        <w:t xml:space="preserve">, with no price on it.</w:t>
+      </w:r>
+    </w:p>
+    <w:p>
+      <w:pPr>
+        <w:numPr>
+          <w:ilvl w:val="0"/>
+          <w:numId w:val="1007"/>
+        </w:numPr>
+        <w:pStyle w:val="Compact"/>
+      </w:pPr>
+      <w:r>
+        <w:rPr>
+          <w:bCs/>
+          <w:b/>
+        </w:rPr>
+        <w:t xml:space="preserve">Sticky bar at the bottom:</w:t>
+      </w:r>
+      <w:r>
+        <w:t xml:space="preserve"> </w:t>
+      </w:r>
+      <w:r>
+        <w:t xml:space="preserve">shows the per-month price for the selected plan,</w:t>
+      </w:r>
+      <w:r>
+        <w:t xml:space="preserve"> </w:t>
+      </w:r>
+      <w:r>
+        <w:t xml:space="preserve">“</w:t>
+      </w:r>
+      <w:r>
+        <w:t xml:space="preserve">Add to cart</w:t>
+      </w:r>
+      <w:r>
+        <w:t xml:space="preserve"> </w:t>
+      </w:r>
+      <w:r>
+        <w:rPr>
+          <w:strike/>
+        </w:rPr>
+        <w:t xml:space="preserve">£70</w:t>
+      </w:r>
+      <w:r>
+        <w:t xml:space="preserve"> </w:t>
+      </w:r>
+      <w:r>
+        <w:t xml:space="preserve">£50/mo</w:t>
+      </w:r>
+      <w:r>
+        <w:t xml:space="preserve">”</w:t>
+      </w:r>
+      <w:r>
+        <w:t xml:space="preserve"> </w:t>
+      </w:r>
+      <w:r>
+        <w:t xml:space="preserve">or</w:t>
+      </w:r>
+      <w:r>
+        <w:t xml:space="preserve"> </w:t>
+      </w:r>
+      <w:r>
+        <w:t xml:space="preserve">“</w:t>
+      </w:r>
+      <w:r>
+        <w:rPr>
+          <w:strike/>
+        </w:rPr>
+        <w:t xml:space="preserve">£70</w:t>
+      </w:r>
+      <w:r>
+        <w:t xml:space="preserve"> </w:t>
+      </w:r>
+      <w:r>
+        <w:t xml:space="preserve">£60/mo</w:t>
+      </w:r>
+      <w:r>
+        <w:t xml:space="preserve">”</w:t>
+      </w:r>
+      <w:r>
+        <w:t xml:space="preserve">.</w:t>
+      </w:r>
+    </w:p>
+    <w:bookmarkEnd w:id="27"/>
+    <w:bookmarkStart w:id="28" w:name="product-page-top-of-page"/>
+    <w:p>
+      <w:pPr>
+        <w:pStyle w:val="Heading2"/>
+      </w:pPr>
+      <w:r>
+        <w:t xml:space="preserve">Product page: top of page</w:t>
+      </w:r>
+    </w:p>
+    <w:p>
+      <w:pPr>
+        <w:numPr>
+          <w:ilvl w:val="0"/>
+          <w:numId w:val="1008"/>
+        </w:numPr>
+        <w:pStyle w:val="Compact"/>
+      </w:pPr>
+      <w:r>
+        <w:rPr>
+          <w:bCs/>
+          <w:b/>
+        </w:rPr>
+        <w:t xml:space="preserve">On phones, AgeMate-style, from the top:</w:t>
       </w:r>
     </w:p>
     <w:p>
@@ -1154,10 +1115,16 @@
         <w:pStyle w:val="Compact"/>
       </w:pPr>
       <w:r>
+        <w:t xml:space="preserve">Stars and</w:t>
+      </w:r>
+      <w:r>
+        <w:t xml:space="preserve"> </w:t>
+      </w:r>
+      <w:r>
         <w:t xml:space="preserve">“</w:t>
       </w:r>
       <w:r>
-        <w:t xml:space="preserve">MUTO</w:t>
+        <w:t xml:space="preserve">4.83 out of 5</w:t>
       </w:r>
       <w:r>
         <w:t xml:space="preserve">”</w:t>
@@ -1166,7 +1133,7 @@
         <w:t xml:space="preserve"> </w:t>
       </w:r>
       <w:r>
-        <w:t xml:space="preserve">above the title.</w:t>
+        <w:t xml:space="preserve">(bigger stars, Neue Haas, no underline).</w:t>
       </w:r>
     </w:p>
     <w:p>
@@ -1178,25 +1145,14 @@
         <w:pStyle w:val="Compact"/>
       </w:pPr>
       <w:r>
-        <w:t xml:space="preserve">The</w:t>
-      </w:r>
-      <w:r>
-        <w:t xml:space="preserve"> </w:t>
-      </w:r>
-      <w:r>
-        <w:t xml:space="preserve">“</w:t>
-      </w:r>
-      <w:r>
-        <w:t xml:space="preserve">Ingredients + nutritional information</w:t>
-      </w:r>
-      <w:r>
-        <w:t xml:space="preserve">”</w:t>
-      </w:r>
-      <w:r>
-        <w:t xml:space="preserve"> </w:t>
-      </w:r>
-      <w:r>
-        <w:t xml:space="preserve">link.</w:t>
+        <w:rPr>
+          <w:bCs/>
+          <w:b/>
+        </w:rPr>
+        <w:t xml:space="preserve">NAD+ Cellular Complex</w:t>
+      </w:r>
+      <w:r>
+        <w:t xml:space="preserve">.</w:t>
       </w:r>
     </w:p>
     <w:p>
@@ -1208,11 +1164,200 @@
         <w:pStyle w:val="Compact"/>
       </w:pPr>
       <w:r>
+        <w:t xml:space="preserve">“</w:t>
+      </w:r>
+      <w:r>
+        <w:t xml:space="preserve">Everything your body needs after 35 for energy, recovery, stress, immunity and longevity.</w:t>
+      </w:r>
+      <w:r>
+        <w:t xml:space="preserve">”</w:t>
+      </w:r>
+    </w:p>
+    <w:p>
+      <w:pPr>
+        <w:numPr>
+          <w:ilvl w:val="1"/>
+          <w:numId w:val="1009"/>
+        </w:numPr>
+        <w:pStyle w:val="Compact"/>
+      </w:pPr>
+      <w:r>
+        <w:t xml:space="preserve">The images.</w:t>
+      </w:r>
+    </w:p>
+    <w:p>
+      <w:pPr>
+        <w:numPr>
+          <w:ilvl w:val="1"/>
+          <w:numId w:val="1009"/>
+        </w:numPr>
+        <w:pStyle w:val="Compact"/>
+      </w:pPr>
+      <w:r>
+        <w:t xml:space="preserve">A</w:t>
+      </w:r>
+      <w:r>
+        <w:t xml:space="preserve"> </w:t>
+      </w:r>
+      <w:r>
+        <w:rPr>
+          <w:bCs/>
+          <w:b/>
+        </w:rPr>
+        <w:t xml:space="preserve">View third-party testing results</w:t>
+      </w:r>
+      <w:r>
+        <w:t xml:space="preserve"> </w:t>
+      </w:r>
+      <w:r>
+        <w:t xml:space="preserve">button.</w:t>
+      </w:r>
+    </w:p>
+    <w:p>
+      <w:pPr>
+        <w:numPr>
+          <w:ilvl w:val="1"/>
+          <w:numId w:val="1009"/>
+        </w:numPr>
+        <w:pStyle w:val="Compact"/>
+      </w:pPr>
+      <w:r>
+        <w:t xml:space="preserve">The offer: Black Friday box,</w:t>
+      </w:r>
+      <w:r>
+        <w:t xml:space="preserve"> </w:t>
+      </w:r>
+      <w:r>
+        <w:t xml:space="preserve">“</w:t>
+      </w:r>
+      <w:r>
+        <w:t xml:space="preserve">Choose your plan</w:t>
+      </w:r>
+      <w:r>
+        <w:t xml:space="preserve">”</w:t>
+      </w:r>
+      <w:r>
+        <w:t xml:space="preserve">, plans, one-time and the button.</w:t>
+      </w:r>
+    </w:p>
+    <w:p>
+      <w:pPr>
+        <w:numPr>
+          <w:ilvl w:val="1"/>
+          <w:numId w:val="1009"/>
+        </w:numPr>
+        <w:pStyle w:val="Compact"/>
+      </w:pPr>
+      <w:r>
+        <w:t xml:space="preserve">The description, benefits, reviews and folds.</w:t>
+      </w:r>
+    </w:p>
+    <w:p>
+      <w:pPr>
+        <w:numPr>
+          <w:ilvl w:val="0"/>
+          <w:numId w:val="1008"/>
+        </w:numPr>
+        <w:pStyle w:val="Compact"/>
+      </w:pPr>
+      <w:r>
+        <w:rPr>
+          <w:bCs/>
+          <w:b/>
+        </w:rPr>
+        <w:t xml:space="preserve">On desktop:</w:t>
+      </w:r>
+      <w:r>
+        <w:t xml:space="preserve"> </w:t>
+      </w:r>
+      <w:r>
+        <w:t xml:space="preserve">the same parts in the existing two-column layout.</w:t>
+      </w:r>
+    </w:p>
+    <w:p>
+      <w:pPr>
+        <w:numPr>
+          <w:ilvl w:val="0"/>
+          <w:numId w:val="1008"/>
+        </w:numPr>
+        <w:pStyle w:val="Compact"/>
+      </w:pPr>
+      <w:r>
+        <w:rPr>
+          <w:bCs/>
+          <w:b/>
+        </w:rPr>
+        <w:t xml:space="preserve">Removed:</w:t>
+      </w:r>
+    </w:p>
+    <w:p>
+      <w:pPr>
+        <w:numPr>
+          <w:ilvl w:val="1"/>
+          <w:numId w:val="1010"/>
+        </w:numPr>
+        <w:pStyle w:val="Compact"/>
+      </w:pPr>
+      <w:r>
+        <w:t xml:space="preserve">“</w:t>
+      </w:r>
+      <w:r>
+        <w:t xml:space="preserve">MUTO</w:t>
+      </w:r>
+      <w:r>
+        <w:t xml:space="preserve">”</w:t>
+      </w:r>
+      <w:r>
+        <w:t xml:space="preserve"> </w:t>
+      </w:r>
+      <w:r>
+        <w:t xml:space="preserve">above the title.</w:t>
+      </w:r>
+    </w:p>
+    <w:p>
+      <w:pPr>
+        <w:numPr>
+          <w:ilvl w:val="1"/>
+          <w:numId w:val="1010"/>
+        </w:numPr>
+        <w:pStyle w:val="Compact"/>
+      </w:pPr>
+      <w:r>
+        <w:t xml:space="preserve">The</w:t>
+      </w:r>
+      <w:r>
+        <w:t xml:space="preserve"> </w:t>
+      </w:r>
+      <w:r>
+        <w:t xml:space="preserve">“</w:t>
+      </w:r>
+      <w:r>
+        <w:t xml:space="preserve">Ingredients + nutritional information</w:t>
+      </w:r>
+      <w:r>
+        <w:t xml:space="preserve">”</w:t>
+      </w:r>
+      <w:r>
+        <w:t xml:space="preserve"> </w:t>
+      </w:r>
+      <w:r>
+        <w:t xml:space="preserve">link.</w:t>
+      </w:r>
+    </w:p>
+    <w:p>
+      <w:pPr>
+        <w:numPr>
+          <w:ilvl w:val="1"/>
+          <w:numId w:val="1010"/>
+        </w:numPr>
+        <w:pStyle w:val="Compact"/>
+      </w:pPr>
+      <w:r>
         <w:t xml:space="preserve">The second testing button lower in the buy box.</w:t>
       </w:r>
     </w:p>
-    <w:bookmarkEnd w:id="27"/>
-    <w:bookmarkStart w:id="28" w:name="cart-drawer-all-pages"/>
+    <w:bookmarkEnd w:id="28"/>
+    <w:bookmarkStart w:id="29" w:name="cart-drawer-all-pages"/>
     <w:p>
       <w:pPr>
         <w:pStyle w:val="Heading2"/>
@@ -1225,7 +1370,7 @@
       <w:pPr>
         <w:numPr>
           <w:ilvl w:val="0"/>
-          <w:numId w:val="1010"/>
+          <w:numId w:val="1011"/>
         </w:numPr>
         <w:pStyle w:val="Compact"/>
       </w:pPr>
@@ -1268,91 +1413,6 @@
       </w:r>
       <w:r>
         <w:t xml:space="preserve">. Each gift is a small row with picture, name, value crossed out and FREE. The order is creatine, socks, bottle, ebook, jar, then the Garmin entry last.</w:t>
-      </w:r>
-    </w:p>
-    <w:p>
-      <w:pPr>
-        <w:numPr>
-          <w:ilvl w:val="1"/>
-          <w:numId w:val="1011"/>
-        </w:numPr>
-        <w:pStyle w:val="Compact"/>
-      </w:pPr>
-      <w:r>
-        <w:t xml:space="preserve">With a NAD subscription, the</w:t>
-      </w:r>
-      <w:r>
-        <w:t xml:space="preserve"> </w:t>
-      </w:r>
-      <w:r>
-        <w:rPr>
-          <w:bCs/>
-          <w:b/>
-        </w:rPr>
-        <w:t xml:space="preserve">12-Week Protocol eBook</w:t>
-      </w:r>
-      <w:r>
-        <w:t xml:space="preserve"> </w:t>
-      </w:r>
-      <w:r>
-        <w:t xml:space="preserve">and</w:t>
-      </w:r>
-      <w:r>
-        <w:t xml:space="preserve"> </w:t>
-      </w:r>
-      <w:r>
-        <w:rPr>
-          <w:bCs/>
-          <w:b/>
-        </w:rPr>
-        <w:t xml:space="preserve">Forever Jar</w:t>
-      </w:r>
-      <w:r>
-        <w:t xml:space="preserve"> </w:t>
-      </w:r>
-      <w:r>
-        <w:t xml:space="preserve">(£10 each) are listed as gifts even though they aren’t cart lines.</w:t>
-      </w:r>
-    </w:p>
-    <w:p>
-      <w:pPr>
-        <w:numPr>
-          <w:ilvl w:val="0"/>
-          <w:numId w:val="1010"/>
-        </w:numPr>
-        <w:pStyle w:val="Compact"/>
-      </w:pPr>
-      <w:r>
-        <w:rPr>
-          <w:bCs/>
-          <w:b/>
-        </w:rPr>
-        <w:t xml:space="preserve">Removed:</w:t>
-      </w:r>
-      <w:r>
-        <w:t xml:space="preserve"> </w:t>
-      </w:r>
-      <w:r>
-        <w:t xml:space="preserve">the reviews box and the free-shipping bar.</w:t>
-      </w:r>
-    </w:p>
-    <w:p>
-      <w:pPr>
-        <w:numPr>
-          <w:ilvl w:val="0"/>
-          <w:numId w:val="1010"/>
-        </w:numPr>
-        <w:pStyle w:val="Compact"/>
-      </w:pPr>
-      <w:r>
-        <w:rPr>
-          <w:bCs/>
-          <w:b/>
-        </w:rPr>
-        <w:t xml:space="preserve">If a subscription is in the cart</w:t>
-      </w:r>
-      <w:r>
-        <w:t xml:space="preserve">, a grey box at the top reads:</w:t>
       </w:r>
     </w:p>
     <w:p>
@@ -1364,65 +1424,80 @@
         <w:pStyle w:val="Compact"/>
       </w:pPr>
       <w:r>
-        <w:t xml:space="preserve">“</w:t>
-      </w:r>
-      <w:r>
-        <w:t xml:space="preserve">Feel the difference in 90 days – or get every payment back.</w:t>
-      </w:r>
-      <w:r>
-        <w:t xml:space="preserve">”</w:t>
-      </w:r>
-    </w:p>
-    <w:p>
-      <w:pPr>
-        <w:numPr>
-          <w:ilvl w:val="1"/>
-          <w:numId w:val="1012"/>
-        </w:numPr>
-        <w:pStyle w:val="Compact"/>
-      </w:pPr>
-      <w:r>
-        <w:t xml:space="preserve">“</w:t>
-      </w:r>
-      <w:r>
-        <w:t xml:space="preserve">Skip, pause or cancel online anytime.</w:t>
-      </w:r>
-      <w:r>
-        <w:t xml:space="preserve">”</w:t>
-      </w:r>
-    </w:p>
-    <w:p>
-      <w:pPr>
-        <w:numPr>
-          <w:ilvl w:val="1"/>
-          <w:numId w:val="1012"/>
-        </w:numPr>
-        <w:pStyle w:val="Compact"/>
-      </w:pPr>
-      <w:r>
-        <w:t xml:space="preserve">“</w:t>
-      </w:r>
-      <w:r>
-        <w:t xml:space="preserve">★★★★★ 4.8/5</w:t>
-      </w:r>
-      <w:r>
-        <w:t xml:space="preserve">”</w:t>
+        <w:t xml:space="preserve">With a NAD subscription, the</w:t>
+      </w:r>
+      <w:r>
+        <w:t xml:space="preserve"> </w:t>
+      </w:r>
+      <w:r>
+        <w:rPr>
+          <w:bCs/>
+          <w:b/>
+        </w:rPr>
+        <w:t xml:space="preserve">12-Week Protocol eBook</w:t>
+      </w:r>
+      <w:r>
+        <w:t xml:space="preserve"> </w:t>
+      </w:r>
+      <w:r>
+        <w:t xml:space="preserve">and</w:t>
+      </w:r>
+      <w:r>
+        <w:t xml:space="preserve"> </w:t>
+      </w:r>
+      <w:r>
+        <w:rPr>
+          <w:bCs/>
+          <w:b/>
+        </w:rPr>
+        <w:t xml:space="preserve">Forever Jar</w:t>
+      </w:r>
+      <w:r>
+        <w:t xml:space="preserve"> </w:t>
+      </w:r>
+      <w:r>
+        <w:t xml:space="preserve">(£10 each) are listed as gifts even though they aren’t cart lines.</w:t>
       </w:r>
     </w:p>
     <w:p>
       <w:pPr>
         <w:numPr>
           <w:ilvl w:val="0"/>
-          <w:numId w:val="1010"/>
-        </w:numPr>
-        <w:pStyle w:val="Compact"/>
-      </w:pPr>
-      <w:r>
-        <w:rPr>
-          <w:bCs/>
-          <w:b/>
-        </w:rPr>
-        <w:t xml:space="preserve">Under the NAD title:</w:t>
+          <w:numId w:val="1011"/>
+        </w:numPr>
+        <w:pStyle w:val="Compact"/>
+      </w:pPr>
+      <w:r>
+        <w:rPr>
+          <w:bCs/>
+          <w:b/>
+        </w:rPr>
+        <w:t xml:space="preserve">Removed:</w:t>
+      </w:r>
+      <w:r>
+        <w:t xml:space="preserve"> </w:t>
+      </w:r>
+      <w:r>
+        <w:t xml:space="preserve">the reviews box and the free-shipping bar.</w:t>
+      </w:r>
+    </w:p>
+    <w:p>
+      <w:pPr>
+        <w:numPr>
+          <w:ilvl w:val="0"/>
+          <w:numId w:val="1011"/>
+        </w:numPr>
+        <w:pStyle w:val="Compact"/>
+      </w:pPr>
+      <w:r>
+        <w:rPr>
+          <w:bCs/>
+          <w:b/>
+        </w:rPr>
+        <w:t xml:space="preserve">If a subscription is in the cart</w:t>
+      </w:r>
+      <w:r>
+        <w:t xml:space="preserve">, a grey box at the top reads:</w:t>
       </w:r>
     </w:p>
     <w:p>
@@ -1437,52 +1512,10 @@
         <w:t xml:space="preserve">“</w:t>
       </w:r>
       <w:r>
-        <w:t xml:space="preserve">Replaces 5 supplements · £1.67 a day</w:t>
+        <w:t xml:space="preserve">Feel the difference in 90 days – or get every payment back.</w:t>
       </w:r>
       <w:r>
         <w:t xml:space="preserve">”</w:t>
-      </w:r>
-      <w:r>
-        <w:t xml:space="preserve"> </w:t>
-      </w:r>
-      <w:r>
-        <w:t xml:space="preserve">on Quarterly,</w:t>
-      </w:r>
-      <w:r>
-        <w:t xml:space="preserve"> </w:t>
-      </w:r>
-      <w:r>
-        <w:t xml:space="preserve">“</w:t>
-      </w:r>
-      <w:r>
-        <w:t xml:space="preserve">· £2 a day</w:t>
-      </w:r>
-      <w:r>
-        <w:t xml:space="preserve">”</w:t>
-      </w:r>
-      <w:r>
-        <w:t xml:space="preserve"> </w:t>
-      </w:r>
-      <w:r>
-        <w:t xml:space="preserve">on Monthly, and just</w:t>
-      </w:r>
-      <w:r>
-        <w:t xml:space="preserve"> </w:t>
-      </w:r>
-      <w:r>
-        <w:t xml:space="preserve">“</w:t>
-      </w:r>
-      <w:r>
-        <w:t xml:space="preserve">Replaces 5 supplements</w:t>
-      </w:r>
-      <w:r>
-        <w:t xml:space="preserve">”</w:t>
-      </w:r>
-      <w:r>
-        <w:t xml:space="preserve"> </w:t>
-      </w:r>
-      <w:r>
-        <w:t xml:space="preserve">on one-time.</w:t>
       </w:r>
     </w:p>
     <w:p>
@@ -1494,6 +1527,118 @@
         <w:pStyle w:val="Compact"/>
       </w:pPr>
       <w:r>
+        <w:t xml:space="preserve">“</w:t>
+      </w:r>
+      <w:r>
+        <w:t xml:space="preserve">Skip, pause or cancel online anytime.</w:t>
+      </w:r>
+      <w:r>
+        <w:t xml:space="preserve">”</w:t>
+      </w:r>
+    </w:p>
+    <w:p>
+      <w:pPr>
+        <w:numPr>
+          <w:ilvl w:val="1"/>
+          <w:numId w:val="1013"/>
+        </w:numPr>
+        <w:pStyle w:val="Compact"/>
+      </w:pPr>
+      <w:r>
+        <w:t xml:space="preserve">“</w:t>
+      </w:r>
+      <w:r>
+        <w:t xml:space="preserve">★★★★★ 4.8/5</w:t>
+      </w:r>
+      <w:r>
+        <w:t xml:space="preserve">”</w:t>
+      </w:r>
+    </w:p>
+    <w:p>
+      <w:pPr>
+        <w:numPr>
+          <w:ilvl w:val="0"/>
+          <w:numId w:val="1011"/>
+        </w:numPr>
+        <w:pStyle w:val="Compact"/>
+      </w:pPr>
+      <w:r>
+        <w:rPr>
+          <w:bCs/>
+          <w:b/>
+        </w:rPr>
+        <w:t xml:space="preserve">Under the NAD title:</w:t>
+      </w:r>
+    </w:p>
+    <w:p>
+      <w:pPr>
+        <w:numPr>
+          <w:ilvl w:val="1"/>
+          <w:numId w:val="1014"/>
+        </w:numPr>
+        <w:pStyle w:val="Compact"/>
+      </w:pPr>
+      <w:r>
+        <w:t xml:space="preserve">“</w:t>
+      </w:r>
+      <w:r>
+        <w:t xml:space="preserve">Replaces 5 supplements · £1.67 a day</w:t>
+      </w:r>
+      <w:r>
+        <w:t xml:space="preserve">”</w:t>
+      </w:r>
+      <w:r>
+        <w:t xml:space="preserve"> </w:t>
+      </w:r>
+      <w:r>
+        <w:t xml:space="preserve">on Quarterly,</w:t>
+      </w:r>
+      <w:r>
+        <w:t xml:space="preserve"> </w:t>
+      </w:r>
+      <w:r>
+        <w:t xml:space="preserve">“</w:t>
+      </w:r>
+      <w:r>
+        <w:t xml:space="preserve">· £2 a day</w:t>
+      </w:r>
+      <w:r>
+        <w:t xml:space="preserve">”</w:t>
+      </w:r>
+      <w:r>
+        <w:t xml:space="preserve"> </w:t>
+      </w:r>
+      <w:r>
+        <w:t xml:space="preserve">on Monthly, and just</w:t>
+      </w:r>
+      <w:r>
+        <w:t xml:space="preserve"> </w:t>
+      </w:r>
+      <w:r>
+        <w:t xml:space="preserve">“</w:t>
+      </w:r>
+      <w:r>
+        <w:t xml:space="preserve">Replaces 5 supplements</w:t>
+      </w:r>
+      <w:r>
+        <w:t xml:space="preserve">”</w:t>
+      </w:r>
+      <w:r>
+        <w:t xml:space="preserve"> </w:t>
+      </w:r>
+      <w:r>
+        <w:t xml:space="preserve">on one-time.</w:t>
+      </w:r>
+    </w:p>
+    <w:p>
+      <w:pPr>
+        <w:numPr>
+          <w:ilvl w:val="1"/>
+          <w:numId w:val="1014"/>
+        </w:numPr>
+        <w:pStyle w:val="Compact"/>
+      </w:pPr>
+      <w:r>
         <w:t xml:space="preserve">A green ticked line:</w:t>
       </w:r>
       <w:r>
@@ -1534,7 +1679,7 @@
       <w:pPr>
         <w:numPr>
           <w:ilvl w:val="0"/>
-          <w:numId w:val="1010"/>
+          <w:numId w:val="1011"/>
         </w:numPr>
         <w:pStyle w:val="Compact"/>
       </w:pPr>
@@ -1556,7 +1701,7 @@
       <w:pPr>
         <w:numPr>
           <w:ilvl w:val="0"/>
-          <w:numId w:val="1010"/>
+          <w:numId w:val="1011"/>
         </w:numPr>
         <w:pStyle w:val="Compact"/>
       </w:pPr>
@@ -1628,7 +1773,7 @@
       <w:pPr>
         <w:numPr>
           <w:ilvl w:val="0"/>
-          <w:numId w:val="1010"/>
+          <w:numId w:val="1011"/>
         </w:numPr>
         <w:pStyle w:val="Compact"/>
       </w:pPr>
@@ -1657,7 +1802,7 @@
       <w:pPr>
         <w:numPr>
           <w:ilvl w:val="0"/>
-          <w:numId w:val="1010"/>
+          <w:numId w:val="1011"/>
         </w:numPr>
         <w:pStyle w:val="Compact"/>
       </w:pPr>
@@ -1688,7 +1833,7 @@
       <w:pPr>
         <w:numPr>
           <w:ilvl w:val="0"/>
-          <w:numId w:val="1010"/>
+          <w:numId w:val="1011"/>
         </w:numPr>
         <w:pStyle w:val="Compact"/>
       </w:pPr>
@@ -1706,9 +1851,9 @@
         <w:t xml:space="preserve">the quantities sent with checkout are now matched to each cart line by its key, not by row order. The new row order can’t move a quantity onto the wrong item.</w:t>
       </w:r>
     </w:p>
-    <w:bookmarkEnd w:id="28"/>
     <w:bookmarkEnd w:id="29"/>
-    <w:bookmarkStart w:id="30" w:name="worth-knowing"/>
+    <w:bookmarkEnd w:id="30"/>
+    <w:bookmarkStart w:id="31" w:name="worth-knowing"/>
     <w:p>
       <w:pPr>
         <w:pStyle w:val="Heading1"/>
@@ -1721,7 +1866,7 @@
       <w:pPr>
         <w:numPr>
           <w:ilvl w:val="0"/>
-          <w:numId w:val="1014"/>
+          <w:numId w:val="1015"/>
         </w:numPr>
         <w:pStyle w:val="Compact"/>
       </w:pPr>
@@ -1737,36 +1882,337 @@
       <w:pPr>
         <w:numPr>
           <w:ilvl w:val="1"/>
+          <w:numId w:val="1016"/>
+        </w:numPr>
+        <w:pStyle w:val="Compact"/>
+      </w:pPr>
+      <w:r>
+        <w:t xml:space="preserve">The per-month prices (£50/mo, £60/mo, £70) are typed into the page’s styling, because the theme prints Skio’s billed price. If Skio’s prices change, update them in the</w:t>
+      </w:r>
+      <w:r>
+        <w:t xml:space="preserve"> </w:t>
+      </w:r>
+      <w:r>
+        <w:rPr>
+          <w:rStyle w:val="VerbatimChar"/>
+        </w:rPr>
+        <w:t xml:space="preserve">easy_read</w:t>
+      </w:r>
+      <w:r>
+        <w:t xml:space="preserve"> </w:t>
+      </w:r>
+      <w:r>
+        <w:t xml:space="preserve">Custom Liquid block at the bottom of the template. Search for</w:t>
+      </w:r>
+      <w:r>
+        <w:t xml:space="preserve"> </w:t>
+      </w:r>
+      <w:r>
+        <w:rPr>
+          <w:rStyle w:val="VerbatimChar"/>
+        </w:rPr>
+        <w:t xml:space="preserve">£50/mo</w:t>
+      </w:r>
+      <w:r>
+        <w:t xml:space="preserve">.</w:t>
+      </w:r>
+    </w:p>
+    <w:p>
+      <w:pPr>
+        <w:numPr>
+          <w:ilvl w:val="1"/>
+          <w:numId w:val="1016"/>
+        </w:numPr>
+        <w:pStyle w:val="Compact"/>
+      </w:pPr>
+      <w:r>
+        <w:t xml:space="preserve">The cart’s per-day cost and</w:t>
+      </w:r>
+      <w:r>
+        <w:t xml:space="preserve"> </w:t>
+      </w:r>
+      <w:r>
+        <w:t xml:space="preserve">“</w:t>
+      </w:r>
+      <w:r>
+        <w:t xml:space="preserve">You save</w:t>
+      </w:r>
+      <w:r>
+        <w:t xml:space="preserve">”</w:t>
+      </w:r>
+      <w:r>
+        <w:t xml:space="preserve"> </w:t>
+      </w:r>
+      <w:r>
+        <w:t xml:space="preserve">amounts are worked out from Skio’s prices automatically.</w:t>
+      </w:r>
+    </w:p>
+    <w:p>
+      <w:pPr>
+        <w:numPr>
+          <w:ilvl w:val="0"/>
           <w:numId w:val="1015"/>
         </w:numPr>
         <w:pStyle w:val="Compact"/>
       </w:pPr>
       <w:r>
-        <w:t xml:space="preserve">The per-month prices (£50/mo, £60/mo, £70) are typed into the page’s styling, because the theme prints Skio’s billed price. If Skio’s prices change, update them in the</w:t>
-      </w:r>
-      <w:r>
-        <w:t xml:space="preserve"> </w:t>
-      </w:r>
-      <w:r>
-        <w:rPr>
-          <w:rStyle w:val="VerbatimChar"/>
-        </w:rPr>
-        <w:t xml:space="preserve">easy_read</w:t>
-      </w:r>
-      <w:r>
-        <w:t xml:space="preserve"> </w:t>
-      </w:r>
-      <w:r>
-        <w:t xml:space="preserve">Custom Liquid block at the bottom of the template. Search for</w:t>
-      </w:r>
-      <w:r>
-        <w:t xml:space="preserve"> </w:t>
-      </w:r>
-      <w:r>
-        <w:rPr>
-          <w:rStyle w:val="VerbatimChar"/>
-        </w:rPr>
-        <w:t xml:space="preserve">£50/mo</w:t>
+        <w:rPr>
+          <w:bCs/>
+          <w:b/>
+        </w:rPr>
+        <w:t xml:space="preserve">The Black Friday box:</w:t>
+      </w:r>
+      <w:r>
+        <w:t xml:space="preserve"> </w:t>
+      </w:r>
+      <w:r>
+        <w:t xml:space="preserve">it’s still in the template and hides itself after 23:59 on 28 Oct, as before.</w:t>
+      </w:r>
+    </w:p>
+    <w:p>
+      <w:pPr>
+        <w:numPr>
+          <w:ilvl w:val="0"/>
+          <w:numId w:val="1015"/>
+        </w:numPr>
+        <w:pStyle w:val="Compact"/>
+      </w:pPr>
+      <w:r>
+        <w:rPr>
+          <w:bCs/>
+          <w:b/>
+        </w:rPr>
+        <w:t xml:space="preserve">The editor:</w:t>
+      </w:r>
+      <w:r>
+        <w:t xml:space="preserve"> </w:t>
+      </w:r>
+      <w:r>
+        <w:t xml:space="preserve">the copied template replaces what’s on live. Make any theme-editor tweaks to these pages</w:t>
+      </w:r>
+      <w:r>
+        <w:t xml:space="preserve"> </w:t>
+      </w:r>
+      <w:r>
+        <w:rPr>
+          <w:bCs/>
+          <w:b/>
+        </w:rPr>
+        <w:t xml:space="preserve">after</w:t>
+      </w:r>
+      <w:r>
+        <w:t xml:space="preserve"> </w:t>
+      </w:r>
+      <w:r>
+        <w:t xml:space="preserve">copying, not before.</w:t>
+      </w:r>
+    </w:p>
+    <w:bookmarkEnd w:id="31"/>
+    <w:bookmarkStart w:id="32" w:name="check-after-publishing"/>
+    <w:p>
+      <w:pPr>
+        <w:pStyle w:val="Heading1"/>
+      </w:pPr>
+      <w:r>
+        <w:t xml:space="preserve">Check after publishing</w:t>
+      </w:r>
+    </w:p>
+    <w:p>
+      <w:pPr>
+        <w:numPr>
+          <w:ilvl w:val="0"/>
+          <w:numId w:val="1017"/>
+        </w:numPr>
+        <w:pStyle w:val="Compact"/>
+      </w:pPr>
+      <w:r>
+        <w:t xml:space="preserve">☐</w:t>
+      </w:r>
+      <w:r>
+        <w:t xml:space="preserve"> </w:t>
+      </w:r>
+      <w:r>
+        <w:rPr>
+          <w:bCs/>
+          <w:b/>
+        </w:rPr>
+        <w:t xml:space="preserve">Both URLs, on a phone:</w:t>
+      </w:r>
+      <w:r>
+        <w:t xml:space="preserve"> </w:t>
+      </w:r>
+      <w:r>
+        <w:t xml:space="preserve">stars, title and descriptor sit above the images. The testing button opens the test results.</w:t>
+      </w:r>
+    </w:p>
+    <w:p>
+      <w:pPr>
+        <w:numPr>
+          <w:ilvl w:val="0"/>
+          <w:numId w:val="1017"/>
+        </w:numPr>
+        <w:pStyle w:val="Compact"/>
+      </w:pPr>
+      <w:r>
+        <w:t xml:space="preserve">☐</w:t>
+      </w:r>
+      <w:r>
+        <w:t xml:space="preserve"> </w:t>
+      </w:r>
+      <w:r>
+        <w:rPr>
+          <w:bCs/>
+          <w:b/>
+        </w:rPr>
+        <w:t xml:space="preserve">Plans:</w:t>
+      </w:r>
+      <w:r>
+        <w:t xml:space="preserve"> </w:t>
+      </w:r>
+      <w:r>
+        <w:t xml:space="preserve">Quarterly shows £50/mo,</w:t>
+      </w:r>
+      <w:r>
+        <w:t xml:space="preserve"> </w:t>
+      </w:r>
+      <w:r>
+        <w:rPr>
+          <w:strike/>
+        </w:rPr>
+        <w:t xml:space="preserve">£70</w:t>
+      </w:r>
+      <w:r>
+        <w:t xml:space="preserve"> </w:t>
+      </w:r>
+      <w:r>
+        <w:t xml:space="preserve">and SAVE 28%, and is selected on load. Monthly shows £60/mo,</w:t>
+      </w:r>
+      <w:r>
+        <w:t xml:space="preserve"> </w:t>
+      </w:r>
+      <w:r>
+        <w:rPr>
+          <w:strike/>
+        </w:rPr>
+        <w:t xml:space="preserve">£70</w:t>
+      </w:r>
+      <w:r>
+        <w:t xml:space="preserve"> </w:t>
+      </w:r>
+      <w:r>
+        <w:t xml:space="preserve">and SAVE 14%. Switching plans updates the sticky bar.</w:t>
+      </w:r>
+    </w:p>
+    <w:p>
+      <w:pPr>
+        <w:numPr>
+          <w:ilvl w:val="0"/>
+          <w:numId w:val="1017"/>
+        </w:numPr>
+        <w:pStyle w:val="Compact"/>
+      </w:pPr>
+      <w:r>
+        <w:t xml:space="preserve">☐</w:t>
+      </w:r>
+      <w:r>
+        <w:t xml:space="preserve"> </w:t>
+      </w:r>
+      <w:r>
+        <w:rPr>
+          <w:bCs/>
+          <w:b/>
+        </w:rPr>
+        <w:t xml:space="preserve">Add to cart on Quarterly:</w:t>
+      </w:r>
+    </w:p>
+    <w:p>
+      <w:pPr>
+        <w:numPr>
+          <w:ilvl w:val="1"/>
+          <w:numId w:val="1018"/>
+        </w:numPr>
+        <w:pStyle w:val="Compact"/>
+      </w:pPr>
+      <w:r>
+        <w:t xml:space="preserve">The drawer shows NAD first and the gifts list underneath.</w:t>
+      </w:r>
+    </w:p>
+    <w:p>
+      <w:pPr>
+        <w:numPr>
+          <w:ilvl w:val="1"/>
+          <w:numId w:val="1018"/>
+        </w:numPr>
+        <w:pStyle w:val="Compact"/>
+      </w:pPr>
+      <w:r>
+        <w:t xml:space="preserve">“</w:t>
+      </w:r>
+      <w:r>
+        <w:t xml:space="preserve">£1.67 a day</w:t>
+      </w:r>
+      <w:r>
+        <w:t xml:space="preserve">”</w:t>
+      </w:r>
+      <w:r>
+        <w:t xml:space="preserve"> </w:t>
+      </w:r>
+      <w:r>
+        <w:t xml:space="preserve">and</w:t>
+      </w:r>
+      <w:r>
+        <w:t xml:space="preserve"> </w:t>
+      </w:r>
+      <w:r>
+        <w:t xml:space="preserve">“</w:t>
+      </w:r>
+      <w:r>
+        <w:t xml:space="preserve">You save £60 every 3 months, ongoing</w:t>
+      </w:r>
+      <w:r>
+        <w:t xml:space="preserve">”</w:t>
+      </w:r>
+      <w:r>
+        <w:t xml:space="preserve"> </w:t>
+      </w:r>
+      <w:r>
+        <w:t xml:space="preserve">appear.</w:t>
+      </w:r>
+    </w:p>
+    <w:p>
+      <w:pPr>
+        <w:numPr>
+          <w:ilvl w:val="1"/>
+          <w:numId w:val="1018"/>
+        </w:numPr>
+        <w:pStyle w:val="Compact"/>
+      </w:pPr>
+      <w:r>
+        <w:t xml:space="preserve">The subtotal maths adds up.</w:t>
+      </w:r>
+    </w:p>
+    <w:p>
+      <w:pPr>
+        <w:numPr>
+          <w:ilvl w:val="1"/>
+          <w:numId w:val="1018"/>
+        </w:numPr>
+        <w:pStyle w:val="Compact"/>
+      </w:pPr>
+      <w:r>
+        <w:t xml:space="preserve">The button reads</w:t>
+      </w:r>
+      <w:r>
+        <w:t xml:space="preserve"> </w:t>
+      </w:r>
+      <w:r>
+        <w:t xml:space="preserve">“</w:t>
+      </w:r>
+      <w:r>
+        <w:t xml:space="preserve">Checkout · £…</w:t>
+      </w:r>
+      <w:r>
+        <w:t xml:space="preserve">”</w:t>
       </w:r>
       <w:r>
         <w:t xml:space="preserve">.</w:t>
@@ -1775,13 +2221,29 @@
     <w:p>
       <w:pPr>
         <w:numPr>
-          <w:ilvl w:val="1"/>
-          <w:numId w:val="1015"/>
-        </w:numPr>
-        <w:pStyle w:val="Compact"/>
-      </w:pPr>
-      <w:r>
-        <w:t xml:space="preserve">The cart’s per-day cost and</w:t>
+          <w:ilvl w:val="0"/>
+          <w:numId w:val="1017"/>
+        </w:numPr>
+        <w:pStyle w:val="Compact"/>
+      </w:pPr>
+      <w:r>
+        <w:t xml:space="preserve">☐</w:t>
+      </w:r>
+      <w:r>
+        <w:t xml:space="preserve"> </w:t>
+      </w:r>
+      <w:r>
+        <w:rPr>
+          <w:bCs/>
+          <w:b/>
+        </w:rPr>
+        <w:t xml:space="preserve">Switch to Monthly in the cart:</w:t>
+      </w:r>
+      <w:r>
+        <w:t xml:space="preserve"> </w:t>
+      </w:r>
+      <w:r>
+        <w:t xml:space="preserve">the lines change to</w:t>
       </w:r>
       <w:r>
         <w:t xml:space="preserve"> </w:t>
@@ -1790,7 +2252,7 @@
         <w:t xml:space="preserve">“</w:t>
       </w:r>
       <w:r>
-        <w:t xml:space="preserve">You save</w:t>
+        <w:t xml:space="preserve">£2 a day</w:t>
       </w:r>
       <w:r>
         <w:t xml:space="preserve">”</w:t>
@@ -1799,84 +2261,57 @@
         <w:t xml:space="preserve"> </w:t>
       </w:r>
       <w:r>
-        <w:t xml:space="preserve">amounts are worked out from Skio’s prices automatically.</w:t>
+        <w:t xml:space="preserve">and</w:t>
+      </w:r>
+      <w:r>
+        <w:t xml:space="preserve"> </w:t>
+      </w:r>
+      <w:r>
+        <w:t xml:space="preserve">“</w:t>
+      </w:r>
+      <w:r>
+        <w:t xml:space="preserve">£10 every month</w:t>
+      </w:r>
+      <w:r>
+        <w:t xml:space="preserve">”</w:t>
+      </w:r>
+      <w:r>
+        <w:t xml:space="preserve">.</w:t>
       </w:r>
     </w:p>
     <w:p>
       <w:pPr>
         <w:numPr>
           <w:ilvl w:val="0"/>
-          <w:numId w:val="1014"/>
-        </w:numPr>
-        <w:pStyle w:val="Compact"/>
-      </w:pPr>
-      <w:r>
-        <w:rPr>
-          <w:bCs/>
-          <w:b/>
-        </w:rPr>
-        <w:t xml:space="preserve">The Black Friday box:</w:t>
-      </w:r>
-      <w:r>
-        <w:t xml:space="preserve"> </w:t>
-      </w:r>
-      <w:r>
-        <w:t xml:space="preserve">it’s still in the template and hides itself after 23:59 on 28 Oct, as before.</w:t>
+          <w:numId w:val="1017"/>
+        </w:numPr>
+        <w:pStyle w:val="Compact"/>
+      </w:pPr>
+      <w:r>
+        <w:t xml:space="preserve">☐</w:t>
+      </w:r>
+      <w:r>
+        <w:t xml:space="preserve"> </w:t>
+      </w:r>
+      <w:r>
+        <w:rPr>
+          <w:bCs/>
+          <w:b/>
+        </w:rPr>
+        <w:t xml:space="preserve">One-time purchase:</w:t>
+      </w:r>
+      <w:r>
+        <w:t xml:space="preserve"> </w:t>
+      </w:r>
+      <w:r>
+        <w:t xml:space="preserve">no subscription box, no per-day or savings lines, and no ebook or jar in the gifts.</w:t>
       </w:r>
     </w:p>
     <w:p>
       <w:pPr>
         <w:numPr>
           <w:ilvl w:val="0"/>
-          <w:numId w:val="1014"/>
-        </w:numPr>
-        <w:pStyle w:val="Compact"/>
-      </w:pPr>
-      <w:r>
-        <w:rPr>
-          <w:bCs/>
-          <w:b/>
-        </w:rPr>
-        <w:t xml:space="preserve">The editor:</w:t>
-      </w:r>
-      <w:r>
-        <w:t xml:space="preserve"> </w:t>
-      </w:r>
-      <w:r>
-        <w:t xml:space="preserve">the copied template replaces what’s on live. Make any theme-editor tweaks to these pages</w:t>
-      </w:r>
-      <w:r>
-        <w:t xml:space="preserve"> </w:t>
-      </w:r>
-      <w:r>
-        <w:rPr>
-          <w:bCs/>
-          <w:b/>
-        </w:rPr>
-        <w:t xml:space="preserve">after</w:t>
-      </w:r>
-      <w:r>
-        <w:t xml:space="preserve"> </w:t>
-      </w:r>
-      <w:r>
-        <w:t xml:space="preserve">copying, not before.</w:t>
-      </w:r>
-    </w:p>
-    <w:bookmarkEnd w:id="30"/>
-    <w:bookmarkStart w:id="31" w:name="check-after-publishing"/>
-    <w:p>
-      <w:pPr>
-        <w:pStyle w:val="Heading1"/>
-      </w:pPr>
-      <w:r>
-        <w:t xml:space="preserve">Check after publishing</w:t>
-      </w:r>
-    </w:p>
-    <w:p>
-      <w:pPr>
-        <w:numPr>
-          <w:ilvl w:val="0"/>
-          <w:numId w:val="1016"/>
+          <w:numId w:val="1017"/>
         </w:numPr>
         <w:pStyle w:val="Compact"/>
       </w:pPr>
@@ -1891,296 +2326,6 @@
           <w:bCs/>
           <w:b/>
         </w:rPr>
-        <w:t xml:space="preserve">Both URLs, on a phone:</w:t>
-      </w:r>
-      <w:r>
-        <w:t xml:space="preserve"> </w:t>
-      </w:r>
-      <w:r>
-        <w:t xml:space="preserve">stars, title and descriptor sit above the images. The testing button opens the test results.</w:t>
-      </w:r>
-    </w:p>
-    <w:p>
-      <w:pPr>
-        <w:numPr>
-          <w:ilvl w:val="0"/>
-          <w:numId w:val="1016"/>
-        </w:numPr>
-        <w:pStyle w:val="Compact"/>
-      </w:pPr>
-      <w:r>
-        <w:t xml:space="preserve">☐</w:t>
-      </w:r>
-      <w:r>
-        <w:t xml:space="preserve"> </w:t>
-      </w:r>
-      <w:r>
-        <w:rPr>
-          <w:bCs/>
-          <w:b/>
-        </w:rPr>
-        <w:t xml:space="preserve">Plans:</w:t>
-      </w:r>
-      <w:r>
-        <w:t xml:space="preserve"> </w:t>
-      </w:r>
-      <w:r>
-        <w:t xml:space="preserve">Quarterly shows £50/mo,</w:t>
-      </w:r>
-      <w:r>
-        <w:t xml:space="preserve"> </w:t>
-      </w:r>
-      <w:r>
-        <w:rPr>
-          <w:strike/>
-        </w:rPr>
-        <w:t xml:space="preserve">£70</w:t>
-      </w:r>
-      <w:r>
-        <w:t xml:space="preserve"> </w:t>
-      </w:r>
-      <w:r>
-        <w:t xml:space="preserve">and SAVE 28%, and is selected on load. Monthly shows £60/mo,</w:t>
-      </w:r>
-      <w:r>
-        <w:t xml:space="preserve"> </w:t>
-      </w:r>
-      <w:r>
-        <w:rPr>
-          <w:strike/>
-        </w:rPr>
-        <w:t xml:space="preserve">£70</w:t>
-      </w:r>
-      <w:r>
-        <w:t xml:space="preserve"> </w:t>
-      </w:r>
-      <w:r>
-        <w:t xml:space="preserve">and SAVE 14%. Switching plans updates the sticky bar.</w:t>
-      </w:r>
-    </w:p>
-    <w:p>
-      <w:pPr>
-        <w:numPr>
-          <w:ilvl w:val="0"/>
-          <w:numId w:val="1016"/>
-        </w:numPr>
-        <w:pStyle w:val="Compact"/>
-      </w:pPr>
-      <w:r>
-        <w:t xml:space="preserve">☐</w:t>
-      </w:r>
-      <w:r>
-        <w:t xml:space="preserve"> </w:t>
-      </w:r>
-      <w:r>
-        <w:rPr>
-          <w:bCs/>
-          <w:b/>
-        </w:rPr>
-        <w:t xml:space="preserve">Add to cart on Quarterly:</w:t>
-      </w:r>
-    </w:p>
-    <w:p>
-      <w:pPr>
-        <w:numPr>
-          <w:ilvl w:val="1"/>
-          <w:numId w:val="1017"/>
-        </w:numPr>
-        <w:pStyle w:val="Compact"/>
-      </w:pPr>
-      <w:r>
-        <w:t xml:space="preserve">The drawer shows NAD first and the gifts list underneath.</w:t>
-      </w:r>
-    </w:p>
-    <w:p>
-      <w:pPr>
-        <w:numPr>
-          <w:ilvl w:val="1"/>
-          <w:numId w:val="1017"/>
-        </w:numPr>
-        <w:pStyle w:val="Compact"/>
-      </w:pPr>
-      <w:r>
-        <w:t xml:space="preserve">“</w:t>
-      </w:r>
-      <w:r>
-        <w:t xml:space="preserve">£1.67 a day</w:t>
-      </w:r>
-      <w:r>
-        <w:t xml:space="preserve">”</w:t>
-      </w:r>
-      <w:r>
-        <w:t xml:space="preserve"> </w:t>
-      </w:r>
-      <w:r>
-        <w:t xml:space="preserve">and</w:t>
-      </w:r>
-      <w:r>
-        <w:t xml:space="preserve"> </w:t>
-      </w:r>
-      <w:r>
-        <w:t xml:space="preserve">“</w:t>
-      </w:r>
-      <w:r>
-        <w:t xml:space="preserve">You save £60 every 3 months, ongoing</w:t>
-      </w:r>
-      <w:r>
-        <w:t xml:space="preserve">”</w:t>
-      </w:r>
-      <w:r>
-        <w:t xml:space="preserve"> </w:t>
-      </w:r>
-      <w:r>
-        <w:t xml:space="preserve">appear.</w:t>
-      </w:r>
-    </w:p>
-    <w:p>
-      <w:pPr>
-        <w:numPr>
-          <w:ilvl w:val="1"/>
-          <w:numId w:val="1017"/>
-        </w:numPr>
-        <w:pStyle w:val="Compact"/>
-      </w:pPr>
-      <w:r>
-        <w:t xml:space="preserve">The subtotal maths adds up.</w:t>
-      </w:r>
-    </w:p>
-    <w:p>
-      <w:pPr>
-        <w:numPr>
-          <w:ilvl w:val="1"/>
-          <w:numId w:val="1017"/>
-        </w:numPr>
-        <w:pStyle w:val="Compact"/>
-      </w:pPr>
-      <w:r>
-        <w:t xml:space="preserve">The button reads</w:t>
-      </w:r>
-      <w:r>
-        <w:t xml:space="preserve"> </w:t>
-      </w:r>
-      <w:r>
-        <w:t xml:space="preserve">“</w:t>
-      </w:r>
-      <w:r>
-        <w:t xml:space="preserve">Checkout · £…</w:t>
-      </w:r>
-      <w:r>
-        <w:t xml:space="preserve">”</w:t>
-      </w:r>
-      <w:r>
-        <w:t xml:space="preserve">.</w:t>
-      </w:r>
-    </w:p>
-    <w:p>
-      <w:pPr>
-        <w:numPr>
-          <w:ilvl w:val="0"/>
-          <w:numId w:val="1016"/>
-        </w:numPr>
-        <w:pStyle w:val="Compact"/>
-      </w:pPr>
-      <w:r>
-        <w:t xml:space="preserve">☐</w:t>
-      </w:r>
-      <w:r>
-        <w:t xml:space="preserve"> </w:t>
-      </w:r>
-      <w:r>
-        <w:rPr>
-          <w:bCs/>
-          <w:b/>
-        </w:rPr>
-        <w:t xml:space="preserve">Switch to Monthly in the cart:</w:t>
-      </w:r>
-      <w:r>
-        <w:t xml:space="preserve"> </w:t>
-      </w:r>
-      <w:r>
-        <w:t xml:space="preserve">the lines change to</w:t>
-      </w:r>
-      <w:r>
-        <w:t xml:space="preserve"> </w:t>
-      </w:r>
-      <w:r>
-        <w:t xml:space="preserve">“</w:t>
-      </w:r>
-      <w:r>
-        <w:t xml:space="preserve">£2 a day</w:t>
-      </w:r>
-      <w:r>
-        <w:t xml:space="preserve">”</w:t>
-      </w:r>
-      <w:r>
-        <w:t xml:space="preserve"> </w:t>
-      </w:r>
-      <w:r>
-        <w:t xml:space="preserve">and</w:t>
-      </w:r>
-      <w:r>
-        <w:t xml:space="preserve"> </w:t>
-      </w:r>
-      <w:r>
-        <w:t xml:space="preserve">“</w:t>
-      </w:r>
-      <w:r>
-        <w:t xml:space="preserve">£10 every month</w:t>
-      </w:r>
-      <w:r>
-        <w:t xml:space="preserve">”</w:t>
-      </w:r>
-      <w:r>
-        <w:t xml:space="preserve">.</w:t>
-      </w:r>
-    </w:p>
-    <w:p>
-      <w:pPr>
-        <w:numPr>
-          <w:ilvl w:val="0"/>
-          <w:numId w:val="1016"/>
-        </w:numPr>
-        <w:pStyle w:val="Compact"/>
-      </w:pPr>
-      <w:r>
-        <w:t xml:space="preserve">☐</w:t>
-      </w:r>
-      <w:r>
-        <w:t xml:space="preserve"> </w:t>
-      </w:r>
-      <w:r>
-        <w:rPr>
-          <w:bCs/>
-          <w:b/>
-        </w:rPr>
-        <w:t xml:space="preserve">One-time purchase:</w:t>
-      </w:r>
-      <w:r>
-        <w:t xml:space="preserve"> </w:t>
-      </w:r>
-      <w:r>
-        <w:t xml:space="preserve">no subscription box, no per-day or savings lines, and no ebook or jar in the gifts.</w:t>
-      </w:r>
-    </w:p>
-    <w:p>
-      <w:pPr>
-        <w:numPr>
-          <w:ilvl w:val="0"/>
-          <w:numId w:val="1016"/>
-        </w:numPr>
-        <w:pStyle w:val="Compact"/>
-      </w:pPr>
-      <w:r>
-        <w:t xml:space="preserve">☐</w:t>
-      </w:r>
-      <w:r>
-        <w:t xml:space="preserve"> </w:t>
-      </w:r>
-      <w:r>
-        <w:rPr>
-          <w:bCs/>
-          <w:b/>
-        </w:rPr>
         <w:t xml:space="preserve">Quantity:</w:t>
       </w:r>
       <w:r>
@@ -2190,7 +2335,7 @@
         <w:t xml:space="preserve">change the NAD quantity to 2, then check out. Checkout shows 2 NAD and the gifts at their own quantities.</w:t>
       </w:r>
     </w:p>
-    <w:bookmarkEnd w:id="31"/>
+    <w:bookmarkEnd w:id="32"/>
     <w:sectPr/>
   </w:body>
 </w:document>
@@ -2474,6 +2619,9 @@
     <w:abstractNumId w:val="991"/>
   </w:num>
   <w:num w:numId="1005">
+    <w:abstractNumId w:val="991"/>
+  </w:num>
+  <w:num w:numId="1006">
     <w:abstractNumId w:val="99411"/>
     <w:lvlOverride w:ilvl="0">
       <w:startOverride w:val="1"/>
@@ -2503,13 +2651,13 @@
       <w:startOverride w:val="1"/>
     </w:lvlOverride>
   </w:num>
-  <w:num w:numId="1006">
-    <w:abstractNumId w:val="991"/>
-  </w:num>
   <w:num w:numId="1007">
     <w:abstractNumId w:val="991"/>
   </w:num>
   <w:num w:numId="1008">
+    <w:abstractNumId w:val="991"/>
+  </w:num>
+  <w:num w:numId="1009">
     <w:abstractNumId w:val="99411"/>
     <w:lvlOverride w:ilvl="0">
       <w:startOverride w:val="1"/>
@@ -2539,9 +2687,6 @@
       <w:startOverride w:val="1"/>
     </w:lvlOverride>
   </w:num>
-  <w:num w:numId="1009">
-    <w:abstractNumId w:val="991"/>
-  </w:num>
   <w:num w:numId="1010">
     <w:abstractNumId w:val="991"/>
   </w:num>
@@ -2564,6 +2709,9 @@
     <w:abstractNumId w:val="991"/>
   </w:num>
   <w:num w:numId="1017">
+    <w:abstractNumId w:val="991"/>
+  </w:num>
+  <w:num w:numId="1018">
     <w:abstractNumId w:val="991"/>
   </w:num>
 </w:numbering>

</xml_diff>